<commit_message>
Finished the WiFi part and started an MQTT implementation. Verified that OLED and sensor readings work
</commit_message>
<xml_diff>
--- a/doc/analysis/Greenhouse_Technical_Details_and_Technology_Selection.docx
+++ b/doc/analysis/Greenhouse_Technical_Details_and_Technology_Selection.docx
@@ -397,7 +397,7 @@
               <w:bottom w:val="single" w:sz="4" w:space="0" w:color="D9D9D9"/>
               <w:end w:val="single" w:sz="4" w:space="0" w:color="D9D9D9"/>
             </w:tcBorders>
-            <w:shd w:fill="FFFFFF" w:val="clear"/>
+            <w:shd w:fill="81D41A" w:val="clear"/>
             <w:vAlign w:val="center"/>
           </w:tcPr>
           <w:p>
@@ -444,7 +444,7 @@
               <w:bottom w:val="single" w:sz="4" w:space="0" w:color="D9D9D9"/>
               <w:end w:val="single" w:sz="4" w:space="0" w:color="D9D9D9"/>
             </w:tcBorders>
-            <w:shd w:fill="FFFFFF" w:val="clear"/>
+            <w:shd w:fill="81D41A" w:val="clear"/>
             <w:vAlign w:val="center"/>
           </w:tcPr>
           <w:p>
@@ -471,7 +471,7 @@
               <w:bottom w:val="single" w:sz="4" w:space="0" w:color="D9D9D9"/>
               <w:end w:val="single" w:sz="4" w:space="0" w:color="D9D9D9"/>
             </w:tcBorders>
-            <w:shd w:fill="FFFFFF" w:val="clear"/>
+            <w:shd w:fill="81D41A" w:val="clear"/>
             <w:vAlign w:val="center"/>
           </w:tcPr>
           <w:p>
@@ -677,15 +677,7 @@
       </w:r>
       <w:r>
         <w:rPr/>
-        <w:t xml:space="preserve">Use the ESP32 </w:t>
-      </w:r>
-      <w:r>
-        <w:rPr/>
-        <w:t>that I already have</w:t>
-      </w:r>
-      <w:r>
-        <w:rPr/>
-        <w:t>. Its built-in Wi-Fi and sensor interfaces suit the connected greenhouse without an extra communication module. Pico W could also meet these needs, but offers no clear benefit that would justify buying another board for this prototype.</w:t>
+        <w:t>Use the ESP32 that I already have. Its built-in Wi-Fi and sensor interfaces suit the connected greenhouse without an extra communication module. Pico W could also meet these needs, but offers no clear benefit that would justify buying another board for this prototype.</w:t>
       </w:r>
     </w:p>
     <w:p>
@@ -897,7 +889,7 @@
               <w:bottom w:val="single" w:sz="4" w:space="0" w:color="D9D9D9"/>
               <w:end w:val="single" w:sz="4" w:space="0" w:color="D9D9D9"/>
             </w:tcBorders>
-            <w:shd w:fill="FFFFFF" w:val="clear"/>
+            <w:shd w:fill="81D41A" w:val="clear"/>
             <w:vAlign w:val="center"/>
           </w:tcPr>
           <w:p>
@@ -924,7 +916,7 @@
               <w:bottom w:val="single" w:sz="4" w:space="0" w:color="D9D9D9"/>
               <w:end w:val="single" w:sz="4" w:space="0" w:color="D9D9D9"/>
             </w:tcBorders>
-            <w:shd w:fill="FFFFFF" w:val="clear"/>
+            <w:shd w:fill="81D41A" w:val="clear"/>
             <w:vAlign w:val="center"/>
           </w:tcPr>
           <w:p>
@@ -951,7 +943,7 @@
               <w:bottom w:val="single" w:sz="4" w:space="0" w:color="D9D9D9"/>
               <w:end w:val="single" w:sz="4" w:space="0" w:color="D9D9D9"/>
             </w:tcBorders>
-            <w:shd w:fill="FFFFFF" w:val="clear"/>
+            <w:shd w:fill="81D41A" w:val="clear"/>
             <w:vAlign w:val="center"/>
           </w:tcPr>
           <w:p>
@@ -1374,7 +1366,7 @@
               <w:bottom w:val="single" w:sz="4" w:space="0" w:color="D9D9D9"/>
               <w:end w:val="single" w:sz="4" w:space="0" w:color="D9D9D9"/>
             </w:tcBorders>
-            <w:shd w:fill="FFFFFF" w:val="clear"/>
+            <w:shd w:fill="81D41A" w:val="clear"/>
             <w:vAlign w:val="center"/>
           </w:tcPr>
           <w:p>
@@ -1401,7 +1393,7 @@
               <w:bottom w:val="single" w:sz="4" w:space="0" w:color="D9D9D9"/>
               <w:end w:val="single" w:sz="4" w:space="0" w:color="D9D9D9"/>
             </w:tcBorders>
-            <w:shd w:fill="FFFFFF" w:val="clear"/>
+            <w:shd w:fill="81D41A" w:val="clear"/>
             <w:vAlign w:val="center"/>
           </w:tcPr>
           <w:p>
@@ -1428,7 +1420,7 @@
               <w:bottom w:val="single" w:sz="4" w:space="0" w:color="D9D9D9"/>
               <w:end w:val="single" w:sz="4" w:space="0" w:color="D9D9D9"/>
             </w:tcBorders>
-            <w:shd w:fill="FFFFFF" w:val="clear"/>
+            <w:shd w:fill="81D41A" w:val="clear"/>
             <w:vAlign w:val="center"/>
           </w:tcPr>
           <w:p>
@@ -1841,7 +1833,7 @@
               <w:bottom w:val="single" w:sz="4" w:space="0" w:color="D9D9D9"/>
               <w:end w:val="single" w:sz="4" w:space="0" w:color="D9D9D9"/>
             </w:tcBorders>
-            <w:shd w:fill="FFFFFF" w:val="clear"/>
+            <w:shd w:fill="81D41A" w:val="clear"/>
             <w:vAlign w:val="center"/>
           </w:tcPr>
           <w:p>
@@ -1868,7 +1860,7 @@
               <w:bottom w:val="single" w:sz="4" w:space="0" w:color="D9D9D9"/>
               <w:end w:val="single" w:sz="4" w:space="0" w:color="D9D9D9"/>
             </w:tcBorders>
-            <w:shd w:fill="FFFFFF" w:val="clear"/>
+            <w:shd w:fill="81D41A" w:val="clear"/>
             <w:vAlign w:val="center"/>
           </w:tcPr>
           <w:p>
@@ -1895,7 +1887,7 @@
               <w:bottom w:val="single" w:sz="4" w:space="0" w:color="D9D9D9"/>
               <w:end w:val="single" w:sz="4" w:space="0" w:color="D9D9D9"/>
             </w:tcBorders>
-            <w:shd w:fill="FFFFFF" w:val="clear"/>
+            <w:shd w:fill="81D41A" w:val="clear"/>
             <w:vAlign w:val="center"/>
           </w:tcPr>
           <w:p>
@@ -2412,7 +2404,7 @@
               <w:bottom w:val="single" w:sz="4" w:space="0" w:color="D9D9D9"/>
               <w:end w:val="single" w:sz="4" w:space="0" w:color="D9D9D9"/>
             </w:tcBorders>
-            <w:shd w:fill="FFFFFF" w:val="clear"/>
+            <w:shd w:fill="81D41A" w:val="clear"/>
             <w:vAlign w:val="center"/>
           </w:tcPr>
           <w:p>
@@ -2441,7 +2433,7 @@
               <w:bottom w:val="single" w:sz="4" w:space="0" w:color="D9D9D9"/>
               <w:end w:val="single" w:sz="4" w:space="0" w:color="D9D9D9"/>
             </w:tcBorders>
-            <w:shd w:fill="FFFFFF" w:val="clear"/>
+            <w:shd w:fill="81D41A" w:val="clear"/>
             <w:vAlign w:val="center"/>
           </w:tcPr>
           <w:p>
@@ -2468,7 +2460,7 @@
               <w:bottom w:val="single" w:sz="4" w:space="0" w:color="D9D9D9"/>
               <w:end w:val="single" w:sz="4" w:space="0" w:color="D9D9D9"/>
             </w:tcBorders>
-            <w:shd w:fill="FFFFFF" w:val="clear"/>
+            <w:shd w:fill="81D41A" w:val="clear"/>
             <w:vAlign w:val="center"/>
           </w:tcPr>
           <w:p>
@@ -2870,7 +2862,7 @@
               <w:bottom w:val="single" w:sz="4" w:space="0" w:color="D9D9D9"/>
               <w:end w:val="single" w:sz="4" w:space="0" w:color="D9D9D9"/>
             </w:tcBorders>
-            <w:shd w:fill="FFFFFF" w:val="clear"/>
+            <w:shd w:fill="81D41A" w:val="clear"/>
             <w:vAlign w:val="center"/>
           </w:tcPr>
           <w:p>
@@ -2897,7 +2889,7 @@
               <w:bottom w:val="single" w:sz="4" w:space="0" w:color="D9D9D9"/>
               <w:end w:val="single" w:sz="4" w:space="0" w:color="D9D9D9"/>
             </w:tcBorders>
-            <w:shd w:fill="FFFFFF" w:val="clear"/>
+            <w:shd w:fill="81D41A" w:val="clear"/>
             <w:vAlign w:val="center"/>
           </w:tcPr>
           <w:p>
@@ -2924,7 +2916,7 @@
               <w:bottom w:val="single" w:sz="4" w:space="0" w:color="D9D9D9"/>
               <w:end w:val="single" w:sz="4" w:space="0" w:color="D9D9D9"/>
             </w:tcBorders>
-            <w:shd w:fill="FFFFFF" w:val="clear"/>
+            <w:shd w:fill="81D41A" w:val="clear"/>
             <w:vAlign w:val="center"/>
           </w:tcPr>
           <w:p>
@@ -3254,7 +3246,7 @@
               <w:bottom w:val="single" w:sz="4" w:space="0" w:color="D9D9D9"/>
               <w:end w:val="single" w:sz="4" w:space="0" w:color="D9D9D9"/>
             </w:tcBorders>
-            <w:shd w:fill="FFFFFF" w:val="clear"/>
+            <w:shd w:fill="81D41A" w:val="clear"/>
             <w:vAlign w:val="center"/>
           </w:tcPr>
           <w:p>
@@ -3283,7 +3275,7 @@
               <w:bottom w:val="single" w:sz="4" w:space="0" w:color="D9D9D9"/>
               <w:end w:val="single" w:sz="4" w:space="0" w:color="D9D9D9"/>
             </w:tcBorders>
-            <w:shd w:fill="FFFFFF" w:val="clear"/>
+            <w:shd w:fill="81D41A" w:val="clear"/>
             <w:vAlign w:val="center"/>
           </w:tcPr>
           <w:p>
@@ -3310,7 +3302,7 @@
               <w:bottom w:val="single" w:sz="4" w:space="0" w:color="D9D9D9"/>
               <w:end w:val="single" w:sz="4" w:space="0" w:color="D9D9D9"/>
             </w:tcBorders>
-            <w:shd w:fill="FFFFFF" w:val="clear"/>
+            <w:shd w:fill="81D41A" w:val="clear"/>
             <w:vAlign w:val="center"/>
           </w:tcPr>
           <w:p>
@@ -3722,7 +3714,7 @@
               <w:bottom w:val="single" w:sz="4" w:space="0" w:color="D9D9D9"/>
               <w:end w:val="single" w:sz="4" w:space="0" w:color="D9D9D9"/>
             </w:tcBorders>
-            <w:shd w:fill="FFFFFF" w:val="clear"/>
+            <w:shd w:fill="81D41A" w:val="clear"/>
             <w:vAlign w:val="center"/>
           </w:tcPr>
           <w:p>
@@ -3751,7 +3743,7 @@
               <w:bottom w:val="single" w:sz="4" w:space="0" w:color="D9D9D9"/>
               <w:end w:val="single" w:sz="4" w:space="0" w:color="D9D9D9"/>
             </w:tcBorders>
-            <w:shd w:fill="FFFFFF" w:val="clear"/>
+            <w:shd w:fill="81D41A" w:val="clear"/>
             <w:vAlign w:val="center"/>
           </w:tcPr>
           <w:p>
@@ -3778,7 +3770,7 @@
               <w:bottom w:val="single" w:sz="4" w:space="0" w:color="D9D9D9"/>
               <w:end w:val="single" w:sz="4" w:space="0" w:color="D9D9D9"/>
             </w:tcBorders>
-            <w:shd w:fill="FFFFFF" w:val="clear"/>
+            <w:shd w:fill="81D41A" w:val="clear"/>
             <w:vAlign w:val="center"/>
           </w:tcPr>
           <w:p>
@@ -4221,7 +4213,7 @@
               <w:bottom w:val="single" w:sz="4" w:space="0" w:color="D9D9D9"/>
               <w:end w:val="single" w:sz="4" w:space="0" w:color="D9D9D9"/>
             </w:tcBorders>
-            <w:shd w:fill="FFFFFF" w:val="clear"/>
+            <w:shd w:fill="81D41A" w:val="clear"/>
             <w:vAlign w:val="center"/>
           </w:tcPr>
           <w:p>
@@ -4248,7 +4240,7 @@
               <w:bottom w:val="single" w:sz="4" w:space="0" w:color="D9D9D9"/>
               <w:end w:val="single" w:sz="4" w:space="0" w:color="D9D9D9"/>
             </w:tcBorders>
-            <w:shd w:fill="FFFFFF" w:val="clear"/>
+            <w:shd w:fill="81D41A" w:val="clear"/>
             <w:vAlign w:val="center"/>
           </w:tcPr>
           <w:p>
@@ -4275,7 +4267,7 @@
               <w:bottom w:val="single" w:sz="4" w:space="0" w:color="D9D9D9"/>
               <w:end w:val="single" w:sz="4" w:space="0" w:color="D9D9D9"/>
             </w:tcBorders>
-            <w:shd w:fill="FFFFFF" w:val="clear"/>
+            <w:shd w:fill="81D41A" w:val="clear"/>
             <w:vAlign w:val="center"/>
           </w:tcPr>
           <w:p>
@@ -4694,7 +4686,7 @@
               <w:bottom w:val="single" w:sz="4" w:space="0" w:color="D9D9D9"/>
               <w:end w:val="single" w:sz="4" w:space="0" w:color="D9D9D9"/>
             </w:tcBorders>
-            <w:shd w:fill="FFFFFF" w:val="clear"/>
+            <w:shd w:fill="81D41A" w:val="clear"/>
             <w:vAlign w:val="center"/>
           </w:tcPr>
           <w:p>
@@ -4721,7 +4713,7 @@
               <w:bottom w:val="single" w:sz="4" w:space="0" w:color="D9D9D9"/>
               <w:end w:val="single" w:sz="4" w:space="0" w:color="D9D9D9"/>
             </w:tcBorders>
-            <w:shd w:fill="FFFFFF" w:val="clear"/>
+            <w:shd w:fill="81D41A" w:val="clear"/>
             <w:vAlign w:val="center"/>
           </w:tcPr>
           <w:p>
@@ -4748,7 +4740,7 @@
               <w:bottom w:val="single" w:sz="4" w:space="0" w:color="D9D9D9"/>
               <w:end w:val="single" w:sz="4" w:space="0" w:color="D9D9D9"/>
             </w:tcBorders>
-            <w:shd w:fill="FFFFFF" w:val="clear"/>
+            <w:shd w:fill="81D41A" w:val="clear"/>
             <w:vAlign w:val="center"/>
           </w:tcPr>
           <w:p>
@@ -6543,6 +6535,15 @@
       </w:pPr>
       <w:r>
         <w:rPr/>
+      </w:r>
+    </w:p>
+    <w:p>
+      <w:pPr>
+        <w:pStyle w:val="Heading2"/>
+        <w:rPr/>
+      </w:pPr>
+      <w:r>
+        <w:rPr/>
         <w:t>8.2  Where the software runs</w:t>
       </w:r>
     </w:p>
@@ -6678,7 +6679,7 @@
               <w:bottom w:val="single" w:sz="4" w:space="0" w:color="D9D9D9"/>
               <w:end w:val="single" w:sz="4" w:space="0" w:color="D9D9D9"/>
             </w:tcBorders>
-            <w:shd w:fill="FFFFFF" w:val="clear"/>
+            <w:shd w:fill="81D41A" w:val="clear"/>
             <w:vAlign w:val="center"/>
           </w:tcPr>
           <w:p>
@@ -6705,7 +6706,7 @@
               <w:bottom w:val="single" w:sz="4" w:space="0" w:color="D9D9D9"/>
               <w:end w:val="single" w:sz="4" w:space="0" w:color="D9D9D9"/>
             </w:tcBorders>
-            <w:shd w:fill="FFFFFF" w:val="clear"/>
+            <w:shd w:fill="81D41A" w:val="clear"/>
             <w:vAlign w:val="center"/>
           </w:tcPr>
           <w:p>
@@ -6732,7 +6733,7 @@
               <w:bottom w:val="single" w:sz="4" w:space="0" w:color="D9D9D9"/>
               <w:end w:val="single" w:sz="4" w:space="0" w:color="D9D9D9"/>
             </w:tcBorders>
-            <w:shd w:fill="FFFFFF" w:val="clear"/>
+            <w:shd w:fill="81D41A" w:val="clear"/>
             <w:vAlign w:val="center"/>
           </w:tcPr>
           <w:p>
@@ -9146,6 +9147,29 @@
     </w:pPr>
     <w:rPr/>
   </w:style>
+  <w:style w:type="paragraph" w:styleId="TableContents">
+    <w:name w:val="Table Contents"/>
+    <w:basedOn w:val="Normal"/>
+    <w:qFormat/>
+    <w:pPr>
+      <w:widowControl w:val="false"/>
+      <w:suppressLineNumbers/>
+    </w:pPr>
+    <w:rPr/>
+  </w:style>
+  <w:style w:type="paragraph" w:styleId="TableHeading">
+    <w:name w:val="Table Heading"/>
+    <w:basedOn w:val="TableContents"/>
+    <w:qFormat/>
+    <w:pPr>
+      <w:suppressLineNumbers/>
+      <w:jc w:val="center"/>
+    </w:pPr>
+    <w:rPr>
+      <w:b/>
+      <w:bCs/>
+    </w:rPr>
+  </w:style>
   <w:style w:type="numbering" w:styleId="NoList" w:default="1">
     <w:name w:val="No List"/>
     <w:uiPriority w:val="99"/>

</xml_diff>